<commit_message>
Add GeoJSON station data and map viewer to Data Formats practical
</commit_message>
<xml_diff>
--- a/02-data-formats-storage/Practical_6_Handout.docx
+++ b/02-data-formats-storage/Practical_6_Handout.docx
@@ -3,9 +3,6 @@
 <w:document xmlns:wpc="http://schemas.microsoft.com/office/word/2010/wordprocessingCanvas" xmlns:mo="http://schemas.microsoft.com/office/mac/office/2008/main" xmlns:mc="http://schemas.openxmlformats.org/markup-compatibility/2006" xmlns:mv="urn:schemas-microsoft-com:mac:vml" xmlns:o="urn:schemas-microsoft-com:office:office" xmlns:r="http://schemas.openxmlformats.org/officeDocument/2006/relationships" xmlns:m="http://schemas.openxmlformats.org/officeDocument/2006/math" xmlns:v="urn:schemas-microsoft-com:vml" xmlns:wp14="http://schemas.microsoft.com/office/word/2010/wordprocessingDrawing" xmlns:wp="http://schemas.openxmlformats.org/drawingml/2006/wordprocessingDrawing" xmlns:w10="urn:schemas-microsoft-com:office:word" xmlns:w="http://schemas.openxmlformats.org/wordprocessingml/2006/main" xmlns:w14="http://schemas.microsoft.com/office/word/2010/wordml" xmlns:wpg="http://schemas.microsoft.com/office/word/2010/wordprocessingGroup" xmlns:wpi="http://schemas.microsoft.com/office/word/2010/wordprocessingInk" xmlns:wne="http://schemas.microsoft.com/office/word/2006/wordml" xmlns:wps="http://schemas.microsoft.com/office/word/2010/wordprocessingShape" mc:Ignorable="w14 wp14">
   <w:body>
     <w:p>
-      <w:pPr>
-        <w:jc w:val="left"/>
-      </w:pPr>
       <w:r>
         <w:rPr>
           <w:b/>
@@ -16,9 +13,6 @@
       </w:r>
     </w:p>
     <w:p>
-      <w:pPr>
-        <w:jc w:val="left"/>
-      </w:pPr>
       <w:r>
         <w:rPr>
           <w:b/>
@@ -82,7 +76,15 @@
         <w:pStyle w:val="ListBullet"/>
       </w:pPr>
       <w:r>
-        <w:t>sample_forecast_snippet.json and sample_station_metadata.xml - for the format tour</w:t>
+        <w:t>sample_forecast_snippet.json, sample_station_metadata.xml and sample_stations.geojson - for the format tour</w:t>
+      </w:r>
+    </w:p>
+    <w:p>
+      <w:pPr>
+        <w:pStyle w:val="ListBullet"/>
+      </w:pPr>
+      <w:r>
+        <w:t>view_stations_map.html - shows the GeoJSON stations plotted on a real map</w:t>
       </w:r>
     </w:p>
     <w:p>
@@ -113,7 +115,7 @@
           <w:color w:val="02C39A"/>
           <w:sz w:val="30"/>
         </w:rPr>
-        <w:t>Part A — A Quick Tour of Formats  (10 min)</w:t>
+        <w:t>Part A — A Quick Tour of Formats  (15 min)</w:t>
       </w:r>
     </w:p>
     <w:p>
@@ -123,7 +125,7 @@
           <w:i w:val="0"/>
           <w:sz w:val="22"/>
         </w:rPr>
-        <w:t>Open all three sample files in a plain text editor (Notepad, VS Code, or similar) and compare them.</w:t>
+        <w:t>Open all four sample files in a plain text editor (Notepad, VS Code, or similar) and compare them.</w:t>
       </w:r>
     </w:p>
     <w:p>
@@ -155,7 +157,33 @@
         <w:pStyle w:val="ListNumber"/>
       </w:pPr>
       <w:r>
-        <w:t>Discuss as a team: which format would you choose for a list of station readings? For a one-off record about a single station? For talking to a web API?</w:t>
+        <w:t>Open sample_stations.geojson - this is JSON too, but shaped to describe map locations: each "feature" is one station, with a "geometry" giving its position.</w:t>
+      </w:r>
+    </w:p>
+    <w:p>
+      <w:r>
+        <w:rPr>
+          <w:b w:val="0"/>
+          <w:i/>
+          <w:sz w:val="22"/>
+        </w:rPr>
+        <w:t>A gotcha worth knowing: GeoJSON coordinates are written as [longitude, latitude] - longitude first. Most people expect latitude first, so this catches people out constantly.</w:t>
+      </w:r>
+    </w:p>
+    <w:p>
+      <w:pPr>
+        <w:pStyle w:val="ListNumber"/>
+      </w:pPr>
+      <w:r>
+        <w:t>Now open view_stations_map.html in a browser. It reads sample_stations.geojson and plots every station as a real point on a map - click a marker to see its details. This is the same data you just read as raw text, now shown the way most people actually want to see it.</w:t>
+      </w:r>
+    </w:p>
+    <w:p>
+      <w:pPr>
+        <w:pStyle w:val="ListNumber"/>
+      </w:pPr>
+      <w:r>
+        <w:t>Discuss as a team: which format would you choose for a list of station readings? For a one-off record about a single station? For a map of station locations?</w:t>
       </w:r>
     </w:p>
     <w:p>
@@ -367,6 +395,14 @@
       </w:pPr>
       <w:r>
         <w:t>CSV and JSON cover most everyday needs; NetCDF is built for larger climate and ocean datasets.</w:t>
+      </w:r>
+    </w:p>
+    <w:p>
+      <w:pPr>
+        <w:pStyle w:val="ListBullet"/>
+      </w:pPr>
+      <w:r>
+        <w:t>GeoJSON is how maps usually store points, lines and shapes - and it’s just JSON underneath, longitude before latitude.</w:t>
       </w:r>
     </w:p>
     <w:p>

</xml_diff>